<commit_message>
Update full name functions
</commit_message>
<xml_diff>
--- a/docassemble/LivingWill/data/templates/Living_Will_DA_Template.docx
+++ b/docassemble/LivingWill/data/templates/Living_Will_DA_Template.docx
@@ -1,6 +1,6 @@
 
 <file path=word/document.xml><?xml version="1.0" encoding="utf-8"?>
-<w:document xmlns:wpc="http://schemas.microsoft.com/office/word/2010/wordprocessingCanvas" xmlns:cx="http://schemas.microsoft.com/office/drawing/2014/chartex" xmlns:mc="http://schemas.openxmlformats.org/markup-compatibility/2006" xmlns:o="urn:schemas-microsoft-com:office:office" xmlns:r="http://schemas.openxmlformats.org/officeDocument/2006/relationships" xmlns:m="http://schemas.openxmlformats.org/officeDocument/2006/math" xmlns:v="urn:schemas-microsoft-com:vml" xmlns:wp14="http://schemas.microsoft.com/office/word/2010/wordprocessingDrawing" xmlns:wp="http://schemas.openxmlformats.org/drawingml/2006/wordprocessingDrawing" xmlns:w10="urn:schemas-microsoft-com:office:word" xmlns:w="http://schemas.openxmlformats.org/wordprocessingml/2006/main" xmlns:w14="http://schemas.microsoft.com/office/word/2010/wordml" xmlns:w15="http://schemas.microsoft.com/office/word/2012/wordml" xmlns:w16se="http://schemas.microsoft.com/office/word/2015/wordml/symex" xmlns:wpg="http://schemas.microsoft.com/office/word/2010/wordprocessingGroup" xmlns:wpi="http://schemas.microsoft.com/office/word/2010/wordprocessingInk" xmlns:wne="http://schemas.microsoft.com/office/word/2006/wordml" xmlns:wps="http://schemas.microsoft.com/office/word/2010/wordprocessingShape" mc:Ignorable="w14 w15 w16se wp14">
+<w:document xmlns:wpc="http://schemas.microsoft.com/office/word/2010/wordprocessingCanvas" xmlns:cx="http://schemas.microsoft.com/office/drawing/2014/chartex" xmlns:cx1="http://schemas.microsoft.com/office/drawing/2015/9/8/chartex" xmlns:cx2="http://schemas.microsoft.com/office/drawing/2015/10/21/chartex" xmlns:cx3="http://schemas.microsoft.com/office/drawing/2016/5/9/chartex" xmlns:cx4="http://schemas.microsoft.com/office/drawing/2016/5/10/chartex" xmlns:cx5="http://schemas.microsoft.com/office/drawing/2016/5/11/chartex" xmlns:cx6="http://schemas.microsoft.com/office/drawing/2016/5/12/chartex" xmlns:cx7="http://schemas.microsoft.com/office/drawing/2016/5/13/chartex" xmlns:cx8="http://schemas.microsoft.com/office/drawing/2016/5/14/chartex" xmlns:mc="http://schemas.openxmlformats.org/markup-compatibility/2006" xmlns:aink="http://schemas.microsoft.com/office/drawing/2016/ink" xmlns:am3d="http://schemas.microsoft.com/office/drawing/2017/model3d" xmlns:o="urn:schemas-microsoft-com:office:office" xmlns:oel="http://schemas.microsoft.com/office/2019/extlst" xmlns:r="http://schemas.openxmlformats.org/officeDocument/2006/relationships" xmlns:m="http://schemas.openxmlformats.org/officeDocument/2006/math" xmlns:v="urn:schemas-microsoft-com:vml" xmlns:wp14="http://schemas.microsoft.com/office/word/2010/wordprocessingDrawing" xmlns:wp="http://schemas.openxmlformats.org/drawingml/2006/wordprocessingDrawing" xmlns:w10="urn:schemas-microsoft-com:office:word" xmlns:w="http://schemas.openxmlformats.org/wordprocessingml/2006/main" xmlns:w14="http://schemas.microsoft.com/office/word/2010/wordml" xmlns:w15="http://schemas.microsoft.com/office/word/2012/wordml" xmlns:w16cex="http://schemas.microsoft.com/office/word/2018/wordml/cex" xmlns:w16cid="http://schemas.microsoft.com/office/word/2016/wordml/cid" xmlns:w16="http://schemas.microsoft.com/office/word/2018/wordml" xmlns:w16du="http://schemas.microsoft.com/office/word/2023/wordml/word16du" xmlns:w16sdtdh="http://schemas.microsoft.com/office/word/2020/wordml/sdtdatahash" xmlns:w16sdtfl="http://schemas.microsoft.com/office/word/2024/wordml/sdtformatlock" xmlns:w16se="http://schemas.microsoft.com/office/word/2015/wordml/symex" xmlns:wpg="http://schemas.microsoft.com/office/word/2010/wordprocessingGroup" xmlns:wpi="http://schemas.microsoft.com/office/word/2010/wordprocessingInk" xmlns:wne="http://schemas.microsoft.com/office/word/2006/wordml" xmlns:wps="http://schemas.microsoft.com/office/word/2010/wordprocessingShape" mc:Ignorable="w14 w15 w16se w16cid w16 w16cex w16sdtdh w16sdtfl w16du wp14">
   <w:body>
     <w:p>
       <w:pPr>
@@ -57,6 +57,7 @@
         </w:rPr>
         <w:t xml:space="preserve">This declaration is made </w:t>
       </w:r>
+      <w:proofErr w:type="gramStart"/>
       <w:r>
         <w:rPr>
           <w:color w:val="000000"/>
@@ -73,7 +74,17 @@
           <w:szCs w:val="22"/>
           <w:lang w:val="en"/>
         </w:rPr>
-        <w:t>_____________.</w:t>
+        <w:t>__</w:t>
+      </w:r>
+      <w:proofErr w:type="gramEnd"/>
+      <w:r>
+        <w:rPr>
+          <w:color w:val="000000"/>
+          <w:sz w:val="22"/>
+          <w:szCs w:val="22"/>
+          <w:lang w:val="en"/>
+        </w:rPr>
+        <w:t>___________.</w:t>
       </w:r>
     </w:p>
     <w:p>
@@ -164,7 +175,53 @@
           <w:sz w:val="22"/>
           <w:szCs w:val="22"/>
         </w:rPr>
-        <w:t>{{user.name.full(middle='full')}}</w:t>
+        <w:t>{{</w:t>
+      </w:r>
+      <w:proofErr w:type="spellStart"/>
+      <w:r>
+        <w:rPr>
+          <w:sz w:val="22"/>
+          <w:szCs w:val="22"/>
+        </w:rPr>
+        <w:t>user.</w:t>
+      </w:r>
+      <w:r>
+        <w:rPr>
+          <w:sz w:val="22"/>
+          <w:szCs w:val="22"/>
+        </w:rPr>
+        <w:t>name_</w:t>
+      </w:r>
+      <w:proofErr w:type="gramStart"/>
+      <w:r>
+        <w:rPr>
+          <w:sz w:val="22"/>
+          <w:szCs w:val="22"/>
+        </w:rPr>
+        <w:t>full</w:t>
+      </w:r>
+      <w:proofErr w:type="spellEnd"/>
+      <w:r>
+        <w:rPr>
+          <w:sz w:val="22"/>
+          <w:szCs w:val="22"/>
+        </w:rPr>
+        <w:t>(</w:t>
+      </w:r>
+      <w:proofErr w:type="gramEnd"/>
+      <w:r>
+        <w:rPr>
+          <w:sz w:val="22"/>
+          <w:szCs w:val="22"/>
+        </w:rPr>
+        <w:t>)</w:t>
+      </w:r>
+      <w:r>
+        <w:rPr>
+          <w:sz w:val="22"/>
+          <w:szCs w:val="22"/>
+        </w:rPr>
+        <w:t>}}</w:t>
       </w:r>
       <w:r>
         <w:rPr>
@@ -227,8 +284,33 @@
           <w:sz w:val="22"/>
           <w:szCs w:val="22"/>
         </w:rPr>
-        <w:t>{%p if feeding_tube == False %}</w:t>
-      </w:r>
+        <w:t xml:space="preserve">{%p if </w:t>
+      </w:r>
+      <w:proofErr w:type="spellStart"/>
+      <w:r>
+        <w:rPr>
+          <w:sz w:val="22"/>
+          <w:szCs w:val="22"/>
+        </w:rPr>
+        <w:t>feeding_tube</w:t>
+      </w:r>
+      <w:proofErr w:type="spellEnd"/>
+      <w:r>
+        <w:rPr>
+          <w:sz w:val="22"/>
+          <w:szCs w:val="22"/>
+        </w:rPr>
+        <w:t xml:space="preserve"> == </w:t>
+      </w:r>
+      <w:proofErr w:type="gramStart"/>
+      <w:r>
+        <w:rPr>
+          <w:sz w:val="22"/>
+          <w:szCs w:val="22"/>
+        </w:rPr>
+        <w:t>False %}</w:t>
+      </w:r>
+      <w:proofErr w:type="gramEnd"/>
     </w:p>
     <w:p>
       <w:pPr>
@@ -302,8 +384,17 @@
           <w:sz w:val="22"/>
           <w:szCs w:val="22"/>
         </w:rPr>
-        <w:t>{%p endif %}</w:t>
-      </w:r>
+        <w:t xml:space="preserve">{%p </w:t>
+      </w:r>
+      <w:proofErr w:type="gramStart"/>
+      <w:r>
+        <w:rPr>
+          <w:sz w:val="22"/>
+          <w:szCs w:val="22"/>
+        </w:rPr>
+        <w:t>endif %}</w:t>
+      </w:r>
+      <w:proofErr w:type="gramEnd"/>
     </w:p>
     <w:p>
       <w:pPr>
@@ -328,13 +419,23 @@
           <w:lang w:val="en"/>
         </w:rPr>
       </w:pPr>
-      <w:r>
-        <w:rPr>
-          <w:sz w:val="22"/>
-          <w:szCs w:val="22"/>
-          <w:lang w:val="en"/>
-        </w:rPr>
-        <w:t>Dated:_________________ Signed ______________________________________</w:t>
+      <w:proofErr w:type="gramStart"/>
+      <w:r>
+        <w:rPr>
+          <w:sz w:val="22"/>
+          <w:szCs w:val="22"/>
+          <w:lang w:val="en"/>
+        </w:rPr>
+        <w:t>Dated:_</w:t>
+      </w:r>
+      <w:proofErr w:type="gramEnd"/>
+      <w:r>
+        <w:rPr>
+          <w:sz w:val="22"/>
+          <w:szCs w:val="22"/>
+          <w:lang w:val="en"/>
+        </w:rPr>
+        <w:t>________________ Signed ______________________________________</w:t>
       </w:r>
     </w:p>
     <w:p>
@@ -362,7 +463,16 @@
           <w:szCs w:val="22"/>
           <w:lang w:val="en"/>
         </w:rPr>
-        <w:t>Residing at:</w:t>
+        <w:t xml:space="preserve">Residing </w:t>
+      </w:r>
+      <w:proofErr w:type="gramStart"/>
+      <w:r>
+        <w:rPr>
+          <w:sz w:val="22"/>
+          <w:szCs w:val="22"/>
+          <w:lang w:val="en"/>
+        </w:rPr>
+        <w:t>at:</w:t>
       </w:r>
       <w:r>
         <w:rPr>
@@ -379,6 +489,7 @@
         </w:rPr>
         <w:t>{{</w:t>
       </w:r>
+      <w:proofErr w:type="spellStart"/>
       <w:r>
         <w:rPr>
           <w:color w:val="1D1C1D"/>
@@ -386,29 +497,139 @@
           <w:szCs w:val="22"/>
           <w:shd w:val="clear" w:color="auto" w:fill="F8F8F8"/>
         </w:rPr>
-        <w:t>user.address.line_one(bare = True)}}</w:t>
-      </w:r>
-      <w:r>
-        <w:rPr>
-          <w:sz w:val="22"/>
-          <w:szCs w:val="22"/>
-        </w:rPr>
-        <w:t>, {{user.address.line_two()}}, {{</w:t>
-      </w:r>
-      <w:r>
-        <w:rPr>
-          <w:sz w:val="22"/>
-          <w:szCs w:val="22"/>
-        </w:rPr>
-        <w:t>trial_court</w:t>
-      </w:r>
-      <w:r>
-        <w:rPr>
-          <w:sz w:val="22"/>
-          <w:szCs w:val="22"/>
-        </w:rPr>
-        <w:t>.address.county</w:t>
-      </w:r>
+        <w:t>user.address</w:t>
+      </w:r>
+      <w:proofErr w:type="gramEnd"/>
+      <w:r>
+        <w:rPr>
+          <w:color w:val="1D1C1D"/>
+          <w:sz w:val="22"/>
+          <w:szCs w:val="22"/>
+          <w:shd w:val="clear" w:color="auto" w:fill="F8F8F8"/>
+        </w:rPr>
+        <w:t>.line_</w:t>
+      </w:r>
+      <w:proofErr w:type="gramStart"/>
+      <w:r>
+        <w:rPr>
+          <w:color w:val="1D1C1D"/>
+          <w:sz w:val="22"/>
+          <w:szCs w:val="22"/>
+          <w:shd w:val="clear" w:color="auto" w:fill="F8F8F8"/>
+        </w:rPr>
+        <w:t>one</w:t>
+      </w:r>
+      <w:proofErr w:type="spellEnd"/>
+      <w:r>
+        <w:rPr>
+          <w:color w:val="1D1C1D"/>
+          <w:sz w:val="22"/>
+          <w:szCs w:val="22"/>
+          <w:shd w:val="clear" w:color="auto" w:fill="F8F8F8"/>
+        </w:rPr>
+        <w:t>(</w:t>
+      </w:r>
+      <w:proofErr w:type="gramEnd"/>
+      <w:r>
+        <w:rPr>
+          <w:color w:val="1D1C1D"/>
+          <w:sz w:val="22"/>
+          <w:szCs w:val="22"/>
+          <w:shd w:val="clear" w:color="auto" w:fill="F8F8F8"/>
+        </w:rPr>
+        <w:t xml:space="preserve">bare = </w:t>
+      </w:r>
+      <w:proofErr w:type="gramStart"/>
+      <w:r>
+        <w:rPr>
+          <w:color w:val="1D1C1D"/>
+          <w:sz w:val="22"/>
+          <w:szCs w:val="22"/>
+          <w:shd w:val="clear" w:color="auto" w:fill="F8F8F8"/>
+        </w:rPr>
+        <w:t>True)}}</w:t>
+      </w:r>
+      <w:proofErr w:type="gramEnd"/>
+      <w:r>
+        <w:rPr>
+          <w:sz w:val="22"/>
+          <w:szCs w:val="22"/>
+        </w:rPr>
+        <w:t>, {{</w:t>
+      </w:r>
+      <w:proofErr w:type="spellStart"/>
+      <w:proofErr w:type="gramStart"/>
+      <w:r>
+        <w:rPr>
+          <w:sz w:val="22"/>
+          <w:szCs w:val="22"/>
+        </w:rPr>
+        <w:t>user.address</w:t>
+      </w:r>
+      <w:proofErr w:type="gramEnd"/>
+      <w:r>
+        <w:rPr>
+          <w:sz w:val="22"/>
+          <w:szCs w:val="22"/>
+        </w:rPr>
+        <w:t>.line_</w:t>
+      </w:r>
+      <w:proofErr w:type="gramStart"/>
+      <w:r>
+        <w:rPr>
+          <w:sz w:val="22"/>
+          <w:szCs w:val="22"/>
+        </w:rPr>
+        <w:t>two</w:t>
+      </w:r>
+      <w:proofErr w:type="spellEnd"/>
+      <w:r>
+        <w:rPr>
+          <w:sz w:val="22"/>
+          <w:szCs w:val="22"/>
+        </w:rPr>
+        <w:t>(</w:t>
+      </w:r>
+      <w:proofErr w:type="gramEnd"/>
+      <w:r>
+        <w:rPr>
+          <w:sz w:val="22"/>
+          <w:szCs w:val="22"/>
+        </w:rPr>
+        <w:t>)}}, {{</w:t>
+      </w:r>
+      <w:proofErr w:type="spellStart"/>
+      <w:r>
+        <w:rPr>
+          <w:sz w:val="22"/>
+          <w:szCs w:val="22"/>
+        </w:rPr>
+        <w:t>trial_</w:t>
+      </w:r>
+      <w:proofErr w:type="gramStart"/>
+      <w:r>
+        <w:rPr>
+          <w:sz w:val="22"/>
+          <w:szCs w:val="22"/>
+        </w:rPr>
+        <w:t>court</w:t>
+      </w:r>
+      <w:r>
+        <w:rPr>
+          <w:sz w:val="22"/>
+          <w:szCs w:val="22"/>
+        </w:rPr>
+        <w:t>.address</w:t>
+      </w:r>
+      <w:proofErr w:type="gramEnd"/>
+      <w:r>
+        <w:rPr>
+          <w:sz w:val="22"/>
+          <w:szCs w:val="22"/>
+        </w:rPr>
+        <w:t>.county</w:t>
+      </w:r>
+      <w:proofErr w:type="spellEnd"/>
       <w:r>
         <w:rPr>
           <w:sz w:val="22"/>
@@ -484,7 +705,25 @@
           <w:szCs w:val="22"/>
           <w:lang w:val="en"/>
         </w:rPr>
-        <w:t>The declarant is personally known to me and I believe him or her to be of sound mind. I saw the declarant sign the declaration in my presence (or the declarant acknowledged in my presence that he or she had signed the declaration) and I signed the declaration as a witness in the presence of the declarant. I did not sign the declarant's signature above for or at the direction of the declarant. At the date of this instrument, I am not entitled to any portion of the estate of the declarant according to the laws of intestate succession or, to the best of my knowledge and belief, under any will of declarant or other instrument taking effect at declarant's death, or directly financially responsible for declarant's medical care.</w:t>
+        <w:t xml:space="preserve">The declarant is personally known to </w:t>
+      </w:r>
+      <w:proofErr w:type="gramStart"/>
+      <w:r>
+        <w:rPr>
+          <w:sz w:val="22"/>
+          <w:szCs w:val="22"/>
+          <w:lang w:val="en"/>
+        </w:rPr>
+        <w:t>me</w:t>
+      </w:r>
+      <w:proofErr w:type="gramEnd"/>
+      <w:r>
+        <w:rPr>
+          <w:sz w:val="22"/>
+          <w:szCs w:val="22"/>
+          <w:lang w:val="en"/>
+        </w:rPr>
+        <w:t xml:space="preserve"> and I believe him or her to be of sound mind. I saw the declarant sign the declaration in my presence (or the declarant acknowledged in my presence that he or she had signed the declaration) and I signed the declaration as a witness in the presence of the declarant. I did not sign the declarant's signature above for or at the direction of the declarant. At the date of this instrument, I am not entitled to any portion of the estate of the declarant according to the laws of intestate succession or, to the best of my knowledge and belief, under any will of declarant or other instrument taking effect at declarant's death, or directly financially responsible for declarant's medical care.</w:t>
       </w:r>
     </w:p>
     <w:p>
@@ -617,7 +856,52 @@
                 <w:szCs w:val="22"/>
                 <w:lang w:val="en"/>
               </w:rPr>
-              <w:t>{% if witness[0].known == True</w:t>
+              <w:t xml:space="preserve">{% if </w:t>
+            </w:r>
+            <w:proofErr w:type="gramStart"/>
+            <w:r>
+              <w:rPr>
+                <w:sz w:val="22"/>
+                <w:szCs w:val="22"/>
+                <w:lang w:val="en"/>
+              </w:rPr>
+              <w:t>witness[</w:t>
+            </w:r>
+            <w:proofErr w:type="gramEnd"/>
+            <w:r>
+              <w:rPr>
+                <w:sz w:val="22"/>
+                <w:szCs w:val="22"/>
+                <w:lang w:val="en"/>
+              </w:rPr>
+              <w:t>0</w:t>
+            </w:r>
+            <w:proofErr w:type="gramStart"/>
+            <w:r>
+              <w:rPr>
+                <w:sz w:val="22"/>
+                <w:szCs w:val="22"/>
+                <w:lang w:val="en"/>
+              </w:rPr>
+              <w:t>].known</w:t>
+            </w:r>
+            <w:proofErr w:type="gramEnd"/>
+            <w:r>
+              <w:rPr>
+                <w:sz w:val="22"/>
+                <w:szCs w:val="22"/>
+                <w:lang w:val="en"/>
+              </w:rPr>
+              <w:t xml:space="preserve"> == </w:t>
+            </w:r>
+            <w:proofErr w:type="gramStart"/>
+            <w:r>
+              <w:rPr>
+                <w:sz w:val="22"/>
+                <w:szCs w:val="22"/>
+                <w:lang w:val="en"/>
+              </w:rPr>
+              <w:t>True</w:t>
             </w:r>
             <w:r>
               <w:rPr>
@@ -635,6 +919,7 @@
               </w:rPr>
               <w:t>%}</w:t>
             </w:r>
+            <w:proofErr w:type="gramEnd"/>
           </w:p>
           <w:p>
             <w:pPr>
@@ -647,6 +932,7 @@
                 <w:szCs w:val="22"/>
               </w:rPr>
             </w:pPr>
+            <w:proofErr w:type="gramStart"/>
             <w:r>
               <w:rPr>
                 <w:sz w:val="22"/>
@@ -660,7 +946,47 @@
                 <w:sz w:val="22"/>
                 <w:szCs w:val="22"/>
               </w:rPr>
-              <w:t>{{witness[0].name.full(middle='full')</w:t>
+              <w:t>{{</w:t>
+            </w:r>
+            <w:proofErr w:type="gramEnd"/>
+            <w:r>
+              <w:rPr>
+                <w:sz w:val="22"/>
+                <w:szCs w:val="22"/>
+              </w:rPr>
+              <w:t>witness[0].</w:t>
+            </w:r>
+            <w:proofErr w:type="spellStart"/>
+            <w:r>
+              <w:rPr>
+                <w:sz w:val="22"/>
+                <w:szCs w:val="22"/>
+              </w:rPr>
+              <w:t>name_</w:t>
+            </w:r>
+            <w:proofErr w:type="gramStart"/>
+            <w:r>
+              <w:rPr>
+                <w:sz w:val="22"/>
+                <w:szCs w:val="22"/>
+              </w:rPr>
+              <w:t>full</w:t>
+            </w:r>
+            <w:proofErr w:type="spellEnd"/>
+            <w:r>
+              <w:rPr>
+                <w:sz w:val="22"/>
+                <w:szCs w:val="22"/>
+              </w:rPr>
+              <w:t>(</w:t>
+            </w:r>
+            <w:proofErr w:type="gramEnd"/>
+            <w:r>
+              <w:rPr>
+                <w:sz w:val="22"/>
+                <w:szCs w:val="22"/>
+              </w:rPr>
+              <w:t>)</w:t>
             </w:r>
             <w:r>
               <w:rPr>
@@ -702,6 +1028,7 @@
                 <w:shd w:val="clear" w:color="auto" w:fill="F8F8F8"/>
               </w:rPr>
             </w:pPr>
+            <w:proofErr w:type="gramStart"/>
             <w:r>
               <w:rPr>
                 <w:sz w:val="22"/>
@@ -725,15 +1052,96 @@
                 <w:szCs w:val="22"/>
                 <w:lang w:val="en"/>
               </w:rPr>
-              <w:t>{% if witness[0].location_known == True %}</w:t>
-            </w:r>
-            <w:r>
-              <w:rPr>
-                <w:sz w:val="22"/>
-                <w:szCs w:val="22"/>
-              </w:rPr>
-              <w:t>{{</w:t>
-            </w:r>
+              <w:t>{</w:t>
+            </w:r>
+            <w:proofErr w:type="gramEnd"/>
+            <w:r>
+              <w:rPr>
+                <w:sz w:val="22"/>
+                <w:szCs w:val="22"/>
+                <w:lang w:val="en"/>
+              </w:rPr>
+              <w:t xml:space="preserve">% if </w:t>
+            </w:r>
+            <w:proofErr w:type="gramStart"/>
+            <w:r>
+              <w:rPr>
+                <w:sz w:val="22"/>
+                <w:szCs w:val="22"/>
+                <w:lang w:val="en"/>
+              </w:rPr>
+              <w:t>witness[</w:t>
+            </w:r>
+            <w:proofErr w:type="gramEnd"/>
+            <w:r>
+              <w:rPr>
+                <w:sz w:val="22"/>
+                <w:szCs w:val="22"/>
+                <w:lang w:val="en"/>
+              </w:rPr>
+              <w:t>0</w:t>
+            </w:r>
+            <w:proofErr w:type="gramStart"/>
+            <w:r>
+              <w:rPr>
+                <w:sz w:val="22"/>
+                <w:szCs w:val="22"/>
+                <w:lang w:val="en"/>
+              </w:rPr>
+              <w:t>].</w:t>
+            </w:r>
+            <w:proofErr w:type="spellStart"/>
+            <w:r>
+              <w:rPr>
+                <w:sz w:val="22"/>
+                <w:szCs w:val="22"/>
+                <w:lang w:val="en"/>
+              </w:rPr>
+              <w:t>location</w:t>
+            </w:r>
+            <w:proofErr w:type="gramEnd"/>
+            <w:r>
+              <w:rPr>
+                <w:sz w:val="22"/>
+                <w:szCs w:val="22"/>
+                <w:lang w:val="en"/>
+              </w:rPr>
+              <w:t>_known</w:t>
+            </w:r>
+            <w:proofErr w:type="spellEnd"/>
+            <w:r>
+              <w:rPr>
+                <w:sz w:val="22"/>
+                <w:szCs w:val="22"/>
+                <w:lang w:val="en"/>
+              </w:rPr>
+              <w:t xml:space="preserve"> == True </w:t>
+            </w:r>
+            <w:proofErr w:type="gramStart"/>
+            <w:r>
+              <w:rPr>
+                <w:sz w:val="22"/>
+                <w:szCs w:val="22"/>
+                <w:lang w:val="en"/>
+              </w:rPr>
+              <w:t>%}</w:t>
+            </w:r>
+            <w:r>
+              <w:rPr>
+                <w:sz w:val="22"/>
+                <w:szCs w:val="22"/>
+              </w:rPr>
+              <w:t>{</w:t>
+            </w:r>
+            <w:proofErr w:type="gramEnd"/>
+            <w:r>
+              <w:rPr>
+                <w:sz w:val="22"/>
+                <w:szCs w:val="22"/>
+              </w:rPr>
+              <w:t>{</w:t>
+            </w:r>
+            <w:proofErr w:type="gramStart"/>
             <w:r>
               <w:rPr>
                 <w:color w:val="1D1C1D"/>
@@ -741,8 +1149,89 @@
                 <w:szCs w:val="22"/>
                 <w:shd w:val="clear" w:color="auto" w:fill="F8F8F8"/>
               </w:rPr>
-              <w:t>witness[0].address.line_one(bare = True)}}</w:t>
-            </w:r>
+              <w:t>witness[</w:t>
+            </w:r>
+            <w:proofErr w:type="gramEnd"/>
+            <w:r>
+              <w:rPr>
+                <w:color w:val="1D1C1D"/>
+                <w:sz w:val="22"/>
+                <w:szCs w:val="22"/>
+                <w:shd w:val="clear" w:color="auto" w:fill="F8F8F8"/>
+              </w:rPr>
+              <w:t>0</w:t>
+            </w:r>
+            <w:proofErr w:type="gramStart"/>
+            <w:r>
+              <w:rPr>
+                <w:color w:val="1D1C1D"/>
+                <w:sz w:val="22"/>
+                <w:szCs w:val="22"/>
+                <w:shd w:val="clear" w:color="auto" w:fill="F8F8F8"/>
+              </w:rPr>
+              <w:t>].</w:t>
+            </w:r>
+            <w:proofErr w:type="spellStart"/>
+            <w:r>
+              <w:rPr>
+                <w:color w:val="1D1C1D"/>
+                <w:sz w:val="22"/>
+                <w:szCs w:val="22"/>
+                <w:shd w:val="clear" w:color="auto" w:fill="F8F8F8"/>
+              </w:rPr>
+              <w:t>address</w:t>
+            </w:r>
+            <w:proofErr w:type="gramEnd"/>
+            <w:r>
+              <w:rPr>
+                <w:color w:val="1D1C1D"/>
+                <w:sz w:val="22"/>
+                <w:szCs w:val="22"/>
+                <w:shd w:val="clear" w:color="auto" w:fill="F8F8F8"/>
+              </w:rPr>
+              <w:t>.line_</w:t>
+            </w:r>
+            <w:proofErr w:type="gramStart"/>
+            <w:r>
+              <w:rPr>
+                <w:color w:val="1D1C1D"/>
+                <w:sz w:val="22"/>
+                <w:szCs w:val="22"/>
+                <w:shd w:val="clear" w:color="auto" w:fill="F8F8F8"/>
+              </w:rPr>
+              <w:t>one</w:t>
+            </w:r>
+            <w:proofErr w:type="spellEnd"/>
+            <w:r>
+              <w:rPr>
+                <w:color w:val="1D1C1D"/>
+                <w:sz w:val="22"/>
+                <w:szCs w:val="22"/>
+                <w:shd w:val="clear" w:color="auto" w:fill="F8F8F8"/>
+              </w:rPr>
+              <w:t>(</w:t>
+            </w:r>
+            <w:proofErr w:type="gramEnd"/>
+            <w:r>
+              <w:rPr>
+                <w:color w:val="1D1C1D"/>
+                <w:sz w:val="22"/>
+                <w:szCs w:val="22"/>
+                <w:shd w:val="clear" w:color="auto" w:fill="F8F8F8"/>
+              </w:rPr>
+              <w:t xml:space="preserve">bare = </w:t>
+            </w:r>
+            <w:proofErr w:type="gramStart"/>
+            <w:r>
+              <w:rPr>
+                <w:color w:val="1D1C1D"/>
+                <w:sz w:val="22"/>
+                <w:szCs w:val="22"/>
+                <w:shd w:val="clear" w:color="auto" w:fill="F8F8F8"/>
+              </w:rPr>
+              <w:t>True)}}</w:t>
+            </w:r>
+            <w:proofErr w:type="gramEnd"/>
           </w:p>
           <w:p>
             <w:pPr>
@@ -797,14 +1286,94 @@
                 <w:sz w:val="22"/>
                 <w:szCs w:val="22"/>
               </w:rPr>
-              <w:t>{{witness[0].address.line_two()}}</w:t>
-            </w:r>
-            <w:r>
-              <w:rPr>
-                <w:sz w:val="22"/>
-                <w:szCs w:val="22"/>
-              </w:rPr>
-              <w:t>{% else %}___________________</w:t>
+              <w:t>{{witness[0</w:t>
+            </w:r>
+            <w:proofErr w:type="gramStart"/>
+            <w:r>
+              <w:rPr>
+                <w:sz w:val="22"/>
+                <w:szCs w:val="22"/>
+              </w:rPr>
+              <w:t>].</w:t>
+            </w:r>
+            <w:proofErr w:type="spellStart"/>
+            <w:r>
+              <w:rPr>
+                <w:sz w:val="22"/>
+                <w:szCs w:val="22"/>
+              </w:rPr>
+              <w:t>address</w:t>
+            </w:r>
+            <w:proofErr w:type="gramEnd"/>
+            <w:r>
+              <w:rPr>
+                <w:sz w:val="22"/>
+                <w:szCs w:val="22"/>
+              </w:rPr>
+              <w:t>.line_</w:t>
+            </w:r>
+            <w:proofErr w:type="gramStart"/>
+            <w:r>
+              <w:rPr>
+                <w:sz w:val="22"/>
+                <w:szCs w:val="22"/>
+              </w:rPr>
+              <w:t>two</w:t>
+            </w:r>
+            <w:proofErr w:type="spellEnd"/>
+            <w:r>
+              <w:rPr>
+                <w:sz w:val="22"/>
+                <w:szCs w:val="22"/>
+              </w:rPr>
+              <w:t>(</w:t>
+            </w:r>
+            <w:proofErr w:type="gramEnd"/>
+            <w:r>
+              <w:rPr>
+                <w:sz w:val="22"/>
+                <w:szCs w:val="22"/>
+              </w:rPr>
+              <w:t>)</w:t>
+            </w:r>
+            <w:proofErr w:type="gramStart"/>
+            <w:r>
+              <w:rPr>
+                <w:sz w:val="22"/>
+                <w:szCs w:val="22"/>
+              </w:rPr>
+              <w:t>}}</w:t>
+            </w:r>
+            <w:r>
+              <w:rPr>
+                <w:sz w:val="22"/>
+                <w:szCs w:val="22"/>
+              </w:rPr>
+              <w:t>{</w:t>
+            </w:r>
+            <w:proofErr w:type="gramEnd"/>
+            <w:r>
+              <w:rPr>
+                <w:sz w:val="22"/>
+                <w:szCs w:val="22"/>
+              </w:rPr>
+              <w:t xml:space="preserve">% else </w:t>
+            </w:r>
+            <w:proofErr w:type="gramStart"/>
+            <w:r>
+              <w:rPr>
+                <w:sz w:val="22"/>
+                <w:szCs w:val="22"/>
+              </w:rPr>
+              <w:t>%}_</w:t>
+            </w:r>
+            <w:proofErr w:type="gramEnd"/>
+            <w:r>
+              <w:rPr>
+                <w:sz w:val="22"/>
+                <w:szCs w:val="22"/>
+              </w:rPr>
+              <w:t>__________________</w:t>
             </w:r>
             <w:r>
               <w:rPr>
@@ -882,22 +1451,63 @@
                 <w:sz w:val="22"/>
                 <w:szCs w:val="22"/>
               </w:rPr>
-              <w:t>_________________</w:t>
-            </w:r>
-            <w:r>
-              <w:rPr>
-                <w:sz w:val="22"/>
-                <w:szCs w:val="22"/>
-              </w:rPr>
-              <w:t>{% endif %}</w:t>
-            </w:r>
-            <w:r>
-              <w:rPr>
-                <w:sz w:val="22"/>
-                <w:szCs w:val="22"/>
-              </w:rPr>
-              <w:t>{% else %}</w:t>
-            </w:r>
+              <w:t>________________</w:t>
+            </w:r>
+            <w:proofErr w:type="gramStart"/>
+            <w:r>
+              <w:rPr>
+                <w:sz w:val="22"/>
+                <w:szCs w:val="22"/>
+              </w:rPr>
+              <w:t>_</w:t>
+            </w:r>
+            <w:r>
+              <w:rPr>
+                <w:sz w:val="22"/>
+                <w:szCs w:val="22"/>
+              </w:rPr>
+              <w:t>{</w:t>
+            </w:r>
+            <w:proofErr w:type="gramEnd"/>
+            <w:r>
+              <w:rPr>
+                <w:sz w:val="22"/>
+                <w:szCs w:val="22"/>
+              </w:rPr>
+              <w:t xml:space="preserve">% endif </w:t>
+            </w:r>
+            <w:proofErr w:type="gramStart"/>
+            <w:r>
+              <w:rPr>
+                <w:sz w:val="22"/>
+                <w:szCs w:val="22"/>
+              </w:rPr>
+              <w:t>%}</w:t>
+            </w:r>
+            <w:r>
+              <w:rPr>
+                <w:sz w:val="22"/>
+                <w:szCs w:val="22"/>
+              </w:rPr>
+              <w:t>{</w:t>
+            </w:r>
+            <w:proofErr w:type="gramEnd"/>
+            <w:r>
+              <w:rPr>
+                <w:sz w:val="22"/>
+                <w:szCs w:val="22"/>
+              </w:rPr>
+              <w:t xml:space="preserve">% </w:t>
+            </w:r>
+            <w:proofErr w:type="gramStart"/>
+            <w:r>
+              <w:rPr>
+                <w:sz w:val="22"/>
+                <w:szCs w:val="22"/>
+              </w:rPr>
+              <w:t>else %}</w:t>
+            </w:r>
+            <w:proofErr w:type="gramEnd"/>
           </w:p>
           <w:p>
             <w:pPr>
@@ -1028,15 +1638,40 @@
                 <w:sz w:val="22"/>
                 <w:szCs w:val="22"/>
               </w:rPr>
-              <w:t>_________</w:t>
-            </w:r>
-            <w:r>
-              <w:rPr>
-                <w:sz w:val="22"/>
-                <w:szCs w:val="22"/>
-              </w:rPr>
-              <w:t>{% endif %}</w:t>
-            </w:r>
+              <w:t>________</w:t>
+            </w:r>
+            <w:proofErr w:type="gramStart"/>
+            <w:r>
+              <w:rPr>
+                <w:sz w:val="22"/>
+                <w:szCs w:val="22"/>
+              </w:rPr>
+              <w:t>_</w:t>
+            </w:r>
+            <w:r>
+              <w:rPr>
+                <w:sz w:val="22"/>
+                <w:szCs w:val="22"/>
+              </w:rPr>
+              <w:t>{</w:t>
+            </w:r>
+            <w:proofErr w:type="gramEnd"/>
+            <w:r>
+              <w:rPr>
+                <w:sz w:val="22"/>
+                <w:szCs w:val="22"/>
+              </w:rPr>
+              <w:t xml:space="preserve">% </w:t>
+            </w:r>
+            <w:proofErr w:type="gramStart"/>
+            <w:r>
+              <w:rPr>
+                <w:sz w:val="22"/>
+                <w:szCs w:val="22"/>
+              </w:rPr>
+              <w:t>endif %}</w:t>
+            </w:r>
+            <w:proofErr w:type="gramEnd"/>
           </w:p>
           <w:p>
             <w:pPr>
@@ -1160,14 +1795,34 @@
               </w:rPr>
               <w:t xml:space="preserve">{% if </w:t>
             </w:r>
-            <w:r>
-              <w:rPr>
-                <w:sz w:val="22"/>
-                <w:szCs w:val="22"/>
-                <w:lang w:val="en"/>
-              </w:rPr>
-              <w:t>defined(‘witness[1].known</w:t>
-            </w:r>
+            <w:proofErr w:type="gramStart"/>
+            <w:r>
+              <w:rPr>
+                <w:sz w:val="22"/>
+                <w:szCs w:val="22"/>
+                <w:lang w:val="en"/>
+              </w:rPr>
+              <w:t>defined(‘</w:t>
+            </w:r>
+            <w:proofErr w:type="gramEnd"/>
+            <w:r>
+              <w:rPr>
+                <w:sz w:val="22"/>
+                <w:szCs w:val="22"/>
+                <w:lang w:val="en"/>
+              </w:rPr>
+              <w:t>witness[1</w:t>
+            </w:r>
+            <w:proofErr w:type="gramStart"/>
+            <w:r>
+              <w:rPr>
+                <w:sz w:val="22"/>
+                <w:szCs w:val="22"/>
+                <w:lang w:val="en"/>
+              </w:rPr>
+              <w:t>].known</w:t>
+            </w:r>
+            <w:proofErr w:type="gramEnd"/>
             <w:r>
               <w:rPr>
                 <w:sz w:val="22"/>
@@ -1176,8 +1831,6 @@
               </w:rPr>
               <w:t>’)</w:t>
             </w:r>
-            <w:bookmarkStart w:id="0" w:name="_GoBack"/>
-            <w:bookmarkEnd w:id="0"/>
             <w:r>
               <w:rPr>
                 <w:sz w:val="22"/>
@@ -1192,16 +1845,80 @@
                 <w:szCs w:val="22"/>
                 <w:lang w:val="en"/>
               </w:rPr>
-              <w:t>== True %}</w:t>
-            </w:r>
-            <w:r>
-              <w:rPr>
-                <w:sz w:val="22"/>
-                <w:szCs w:val="22"/>
-                <w:lang w:val="en"/>
-              </w:rPr>
-              <w:t>{% if witness[1].known == True %}</w:t>
-            </w:r>
+              <w:t xml:space="preserve">== True </w:t>
+            </w:r>
+            <w:proofErr w:type="gramStart"/>
+            <w:r>
+              <w:rPr>
+                <w:sz w:val="22"/>
+                <w:szCs w:val="22"/>
+                <w:lang w:val="en"/>
+              </w:rPr>
+              <w:t>%}</w:t>
+            </w:r>
+            <w:r>
+              <w:rPr>
+                <w:sz w:val="22"/>
+                <w:szCs w:val="22"/>
+                <w:lang w:val="en"/>
+              </w:rPr>
+              <w:t>{</w:t>
+            </w:r>
+            <w:proofErr w:type="gramEnd"/>
+            <w:r>
+              <w:rPr>
+                <w:sz w:val="22"/>
+                <w:szCs w:val="22"/>
+                <w:lang w:val="en"/>
+              </w:rPr>
+              <w:t xml:space="preserve">% if </w:t>
+            </w:r>
+            <w:proofErr w:type="gramStart"/>
+            <w:r>
+              <w:rPr>
+                <w:sz w:val="22"/>
+                <w:szCs w:val="22"/>
+                <w:lang w:val="en"/>
+              </w:rPr>
+              <w:t>witness[</w:t>
+            </w:r>
+            <w:proofErr w:type="gramEnd"/>
+            <w:r>
+              <w:rPr>
+                <w:sz w:val="22"/>
+                <w:szCs w:val="22"/>
+                <w:lang w:val="en"/>
+              </w:rPr>
+              <w:t>1</w:t>
+            </w:r>
+            <w:proofErr w:type="gramStart"/>
+            <w:r>
+              <w:rPr>
+                <w:sz w:val="22"/>
+                <w:szCs w:val="22"/>
+                <w:lang w:val="en"/>
+              </w:rPr>
+              <w:t>].known</w:t>
+            </w:r>
+            <w:proofErr w:type="gramEnd"/>
+            <w:r>
+              <w:rPr>
+                <w:sz w:val="22"/>
+                <w:szCs w:val="22"/>
+                <w:lang w:val="en"/>
+              </w:rPr>
+              <w:t xml:space="preserve"> == </w:t>
+            </w:r>
+            <w:proofErr w:type="gramStart"/>
+            <w:r>
+              <w:rPr>
+                <w:sz w:val="22"/>
+                <w:szCs w:val="22"/>
+                <w:lang w:val="en"/>
+              </w:rPr>
+              <w:t>True %}</w:t>
+            </w:r>
+            <w:proofErr w:type="gramEnd"/>
           </w:p>
           <w:p>
             <w:pPr>
@@ -1213,6 +1930,7 @@
                 <w:szCs w:val="22"/>
               </w:rPr>
             </w:pPr>
+            <w:proofErr w:type="gramStart"/>
             <w:r>
               <w:rPr>
                 <w:sz w:val="22"/>
@@ -1226,14 +1944,61 @@
                 <w:sz w:val="22"/>
                 <w:szCs w:val="22"/>
               </w:rPr>
-              <w:t>{{witness[1]</w:t>
-            </w:r>
-            <w:r>
-              <w:rPr>
-                <w:sz w:val="22"/>
-                <w:szCs w:val="22"/>
-              </w:rPr>
-              <w:t>.name.full(middle='full')}}</w:t>
+              <w:t>{{</w:t>
+            </w:r>
+            <w:proofErr w:type="gramEnd"/>
+            <w:r>
+              <w:rPr>
+                <w:sz w:val="22"/>
+                <w:szCs w:val="22"/>
+              </w:rPr>
+              <w:t>witness[1]</w:t>
+            </w:r>
+            <w:r>
+              <w:rPr>
+                <w:sz w:val="22"/>
+                <w:szCs w:val="22"/>
+              </w:rPr>
+              <w:t>.</w:t>
+            </w:r>
+            <w:proofErr w:type="spellStart"/>
+            <w:r>
+              <w:rPr>
+                <w:sz w:val="22"/>
+                <w:szCs w:val="22"/>
+              </w:rPr>
+              <w:t>name_</w:t>
+            </w:r>
+            <w:proofErr w:type="gramStart"/>
+            <w:r>
+              <w:rPr>
+                <w:sz w:val="22"/>
+                <w:szCs w:val="22"/>
+              </w:rPr>
+              <w:t>full</w:t>
+            </w:r>
+            <w:proofErr w:type="spellEnd"/>
+            <w:r>
+              <w:rPr>
+                <w:sz w:val="22"/>
+                <w:szCs w:val="22"/>
+              </w:rPr>
+              <w:t>(</w:t>
+            </w:r>
+            <w:proofErr w:type="gramEnd"/>
+            <w:r>
+              <w:rPr>
+                <w:sz w:val="22"/>
+                <w:szCs w:val="22"/>
+              </w:rPr>
+              <w:t>)</w:t>
+            </w:r>
+            <w:r>
+              <w:rPr>
+                <w:sz w:val="22"/>
+                <w:szCs w:val="22"/>
+              </w:rPr>
+              <w:t>}}</w:t>
             </w:r>
           </w:p>
           <w:p>
@@ -1260,6 +2025,7 @@
                 <w:shd w:val="clear" w:color="auto" w:fill="F8F8F8"/>
               </w:rPr>
             </w:pPr>
+            <w:proofErr w:type="gramStart"/>
             <w:r>
               <w:rPr>
                 <w:sz w:val="22"/>
@@ -1283,23 +2049,96 @@
                 <w:szCs w:val="22"/>
                 <w:lang w:val="en"/>
               </w:rPr>
-              <w:t>{% if witness[1</w:t>
-            </w:r>
-            <w:r>
-              <w:rPr>
-                <w:sz w:val="22"/>
-                <w:szCs w:val="22"/>
-                <w:lang w:val="en"/>
-              </w:rPr>
-              <w:t>].location_known == True %}</w:t>
-            </w:r>
-            <w:r>
-              <w:rPr>
-                <w:sz w:val="22"/>
-                <w:szCs w:val="22"/>
-              </w:rPr>
-              <w:t>{{</w:t>
-            </w:r>
+              <w:t>{</w:t>
+            </w:r>
+            <w:proofErr w:type="gramEnd"/>
+            <w:r>
+              <w:rPr>
+                <w:sz w:val="22"/>
+                <w:szCs w:val="22"/>
+                <w:lang w:val="en"/>
+              </w:rPr>
+              <w:t xml:space="preserve">% if </w:t>
+            </w:r>
+            <w:proofErr w:type="gramStart"/>
+            <w:r>
+              <w:rPr>
+                <w:sz w:val="22"/>
+                <w:szCs w:val="22"/>
+                <w:lang w:val="en"/>
+              </w:rPr>
+              <w:t>witness[</w:t>
+            </w:r>
+            <w:proofErr w:type="gramEnd"/>
+            <w:r>
+              <w:rPr>
+                <w:sz w:val="22"/>
+                <w:szCs w:val="22"/>
+                <w:lang w:val="en"/>
+              </w:rPr>
+              <w:t>1</w:t>
+            </w:r>
+            <w:proofErr w:type="gramStart"/>
+            <w:r>
+              <w:rPr>
+                <w:sz w:val="22"/>
+                <w:szCs w:val="22"/>
+                <w:lang w:val="en"/>
+              </w:rPr>
+              <w:t>].</w:t>
+            </w:r>
+            <w:proofErr w:type="spellStart"/>
+            <w:r>
+              <w:rPr>
+                <w:sz w:val="22"/>
+                <w:szCs w:val="22"/>
+                <w:lang w:val="en"/>
+              </w:rPr>
+              <w:t>location</w:t>
+            </w:r>
+            <w:proofErr w:type="gramEnd"/>
+            <w:r>
+              <w:rPr>
+                <w:sz w:val="22"/>
+                <w:szCs w:val="22"/>
+                <w:lang w:val="en"/>
+              </w:rPr>
+              <w:t>_known</w:t>
+            </w:r>
+            <w:proofErr w:type="spellEnd"/>
+            <w:r>
+              <w:rPr>
+                <w:sz w:val="22"/>
+                <w:szCs w:val="22"/>
+                <w:lang w:val="en"/>
+              </w:rPr>
+              <w:t xml:space="preserve"> == True </w:t>
+            </w:r>
+            <w:proofErr w:type="gramStart"/>
+            <w:r>
+              <w:rPr>
+                <w:sz w:val="22"/>
+                <w:szCs w:val="22"/>
+                <w:lang w:val="en"/>
+              </w:rPr>
+              <w:t>%}</w:t>
+            </w:r>
+            <w:r>
+              <w:rPr>
+                <w:sz w:val="22"/>
+                <w:szCs w:val="22"/>
+              </w:rPr>
+              <w:t>{</w:t>
+            </w:r>
+            <w:proofErr w:type="gramEnd"/>
+            <w:r>
+              <w:rPr>
+                <w:sz w:val="22"/>
+                <w:szCs w:val="22"/>
+              </w:rPr>
+              <w:t>{</w:t>
+            </w:r>
+            <w:proofErr w:type="gramStart"/>
             <w:r>
               <w:rPr>
                 <w:color w:val="1D1C1D"/>
@@ -1307,8 +2146,9 @@
                 <w:szCs w:val="22"/>
                 <w:shd w:val="clear" w:color="auto" w:fill="F8F8F8"/>
               </w:rPr>
-              <w:t>witness[1</w:t>
-            </w:r>
+              <w:t>witness[</w:t>
+            </w:r>
+            <w:proofErr w:type="gramEnd"/>
             <w:r>
               <w:rPr>
                 <w:color w:val="1D1C1D"/>
@@ -1316,8 +2156,79 @@
                 <w:szCs w:val="22"/>
                 <w:shd w:val="clear" w:color="auto" w:fill="F8F8F8"/>
               </w:rPr>
-              <w:t>].address.line_one(bare = True)}}</w:t>
-            </w:r>
+              <w:t>1</w:t>
+            </w:r>
+            <w:proofErr w:type="gramStart"/>
+            <w:r>
+              <w:rPr>
+                <w:color w:val="1D1C1D"/>
+                <w:sz w:val="22"/>
+                <w:szCs w:val="22"/>
+                <w:shd w:val="clear" w:color="auto" w:fill="F8F8F8"/>
+              </w:rPr>
+              <w:t>].</w:t>
+            </w:r>
+            <w:proofErr w:type="spellStart"/>
+            <w:r>
+              <w:rPr>
+                <w:color w:val="1D1C1D"/>
+                <w:sz w:val="22"/>
+                <w:szCs w:val="22"/>
+                <w:shd w:val="clear" w:color="auto" w:fill="F8F8F8"/>
+              </w:rPr>
+              <w:t>address</w:t>
+            </w:r>
+            <w:proofErr w:type="gramEnd"/>
+            <w:r>
+              <w:rPr>
+                <w:color w:val="1D1C1D"/>
+                <w:sz w:val="22"/>
+                <w:szCs w:val="22"/>
+                <w:shd w:val="clear" w:color="auto" w:fill="F8F8F8"/>
+              </w:rPr>
+              <w:t>.line_</w:t>
+            </w:r>
+            <w:proofErr w:type="gramStart"/>
+            <w:r>
+              <w:rPr>
+                <w:color w:val="1D1C1D"/>
+                <w:sz w:val="22"/>
+                <w:szCs w:val="22"/>
+                <w:shd w:val="clear" w:color="auto" w:fill="F8F8F8"/>
+              </w:rPr>
+              <w:t>one</w:t>
+            </w:r>
+            <w:proofErr w:type="spellEnd"/>
+            <w:r>
+              <w:rPr>
+                <w:color w:val="1D1C1D"/>
+                <w:sz w:val="22"/>
+                <w:szCs w:val="22"/>
+                <w:shd w:val="clear" w:color="auto" w:fill="F8F8F8"/>
+              </w:rPr>
+              <w:t>(</w:t>
+            </w:r>
+            <w:proofErr w:type="gramEnd"/>
+            <w:r>
+              <w:rPr>
+                <w:color w:val="1D1C1D"/>
+                <w:sz w:val="22"/>
+                <w:szCs w:val="22"/>
+                <w:shd w:val="clear" w:color="auto" w:fill="F8F8F8"/>
+              </w:rPr>
+              <w:t xml:space="preserve">bare = </w:t>
+            </w:r>
+            <w:proofErr w:type="gramStart"/>
+            <w:r>
+              <w:rPr>
+                <w:color w:val="1D1C1D"/>
+                <w:sz w:val="22"/>
+                <w:szCs w:val="22"/>
+                <w:shd w:val="clear" w:color="auto" w:fill="F8F8F8"/>
+              </w:rPr>
+              <w:t>True)}}</w:t>
+            </w:r>
+            <w:proofErr w:type="gramEnd"/>
           </w:p>
           <w:p>
             <w:pPr>
@@ -1388,26 +2299,99 @@
               </w:rPr>
               <w:t>witness[1</w:t>
             </w:r>
-            <w:r>
-              <w:rPr>
-                <w:sz w:val="22"/>
-                <w:szCs w:val="22"/>
-              </w:rPr>
-              <w:t>].address.line_two()}}</w:t>
-            </w:r>
-            <w:r>
-              <w:rPr>
-                <w:sz w:val="22"/>
-                <w:szCs w:val="22"/>
-              </w:rPr>
-              <w:t>{% else %}</w:t>
-            </w:r>
-            <w:r>
-              <w:rPr>
-                <w:sz w:val="22"/>
-                <w:szCs w:val="22"/>
-              </w:rPr>
-              <w:t>_______________</w:t>
+            <w:proofErr w:type="gramStart"/>
+            <w:r>
+              <w:rPr>
+                <w:sz w:val="22"/>
+                <w:szCs w:val="22"/>
+              </w:rPr>
+              <w:t>].</w:t>
+            </w:r>
+            <w:proofErr w:type="spellStart"/>
+            <w:r>
+              <w:rPr>
+                <w:sz w:val="22"/>
+                <w:szCs w:val="22"/>
+              </w:rPr>
+              <w:t>address</w:t>
+            </w:r>
+            <w:proofErr w:type="gramEnd"/>
+            <w:r>
+              <w:rPr>
+                <w:sz w:val="22"/>
+                <w:szCs w:val="22"/>
+              </w:rPr>
+              <w:t>.line_</w:t>
+            </w:r>
+            <w:proofErr w:type="gramStart"/>
+            <w:r>
+              <w:rPr>
+                <w:sz w:val="22"/>
+                <w:szCs w:val="22"/>
+              </w:rPr>
+              <w:t>two</w:t>
+            </w:r>
+            <w:proofErr w:type="spellEnd"/>
+            <w:r>
+              <w:rPr>
+                <w:sz w:val="22"/>
+                <w:szCs w:val="22"/>
+              </w:rPr>
+              <w:t>(</w:t>
+            </w:r>
+            <w:proofErr w:type="gramEnd"/>
+            <w:r>
+              <w:rPr>
+                <w:sz w:val="22"/>
+                <w:szCs w:val="22"/>
+              </w:rPr>
+              <w:t>)</w:t>
+            </w:r>
+            <w:proofErr w:type="gramStart"/>
+            <w:r>
+              <w:rPr>
+                <w:sz w:val="22"/>
+                <w:szCs w:val="22"/>
+              </w:rPr>
+              <w:t>}}</w:t>
+            </w:r>
+            <w:r>
+              <w:rPr>
+                <w:sz w:val="22"/>
+                <w:szCs w:val="22"/>
+              </w:rPr>
+              <w:t>{</w:t>
+            </w:r>
+            <w:proofErr w:type="gramEnd"/>
+            <w:r>
+              <w:rPr>
+                <w:sz w:val="22"/>
+                <w:szCs w:val="22"/>
+              </w:rPr>
+              <w:t xml:space="preserve">% else </w:t>
+            </w:r>
+            <w:proofErr w:type="gramStart"/>
+            <w:r>
+              <w:rPr>
+                <w:sz w:val="22"/>
+                <w:szCs w:val="22"/>
+              </w:rPr>
+              <w:t>%}</w:t>
+            </w:r>
+            <w:r>
+              <w:rPr>
+                <w:sz w:val="22"/>
+                <w:szCs w:val="22"/>
+              </w:rPr>
+              <w:t>_</w:t>
+            </w:r>
+            <w:proofErr w:type="gramEnd"/>
+            <w:r>
+              <w:rPr>
+                <w:sz w:val="22"/>
+                <w:szCs w:val="22"/>
+              </w:rPr>
+              <w:t>______________</w:t>
             </w:r>
             <w:r>
               <w:rPr>
@@ -1506,22 +2490,63 @@
                 <w:sz w:val="22"/>
                 <w:szCs w:val="22"/>
               </w:rPr>
-              <w:t>_____________________</w:t>
-            </w:r>
-            <w:r>
-              <w:rPr>
-                <w:sz w:val="22"/>
-                <w:szCs w:val="22"/>
-              </w:rPr>
-              <w:t>{% endif %}</w:t>
-            </w:r>
-            <w:r>
-              <w:rPr>
-                <w:sz w:val="22"/>
-                <w:szCs w:val="22"/>
-              </w:rPr>
-              <w:t>{% else %}</w:t>
-            </w:r>
+              <w:t>____________________</w:t>
+            </w:r>
+            <w:proofErr w:type="gramStart"/>
+            <w:r>
+              <w:rPr>
+                <w:sz w:val="22"/>
+                <w:szCs w:val="22"/>
+              </w:rPr>
+              <w:t>_</w:t>
+            </w:r>
+            <w:r>
+              <w:rPr>
+                <w:sz w:val="22"/>
+                <w:szCs w:val="22"/>
+              </w:rPr>
+              <w:t>{</w:t>
+            </w:r>
+            <w:proofErr w:type="gramEnd"/>
+            <w:r>
+              <w:rPr>
+                <w:sz w:val="22"/>
+                <w:szCs w:val="22"/>
+              </w:rPr>
+              <w:t xml:space="preserve">% endif </w:t>
+            </w:r>
+            <w:proofErr w:type="gramStart"/>
+            <w:r>
+              <w:rPr>
+                <w:sz w:val="22"/>
+                <w:szCs w:val="22"/>
+              </w:rPr>
+              <w:t>%}</w:t>
+            </w:r>
+            <w:r>
+              <w:rPr>
+                <w:sz w:val="22"/>
+                <w:szCs w:val="22"/>
+              </w:rPr>
+              <w:t>{</w:t>
+            </w:r>
+            <w:proofErr w:type="gramEnd"/>
+            <w:r>
+              <w:rPr>
+                <w:sz w:val="22"/>
+                <w:szCs w:val="22"/>
+              </w:rPr>
+              <w:t xml:space="preserve">% </w:t>
+            </w:r>
+            <w:proofErr w:type="gramStart"/>
+            <w:r>
+              <w:rPr>
+                <w:sz w:val="22"/>
+                <w:szCs w:val="22"/>
+              </w:rPr>
+              <w:t>else %}</w:t>
+            </w:r>
+            <w:proofErr w:type="gramEnd"/>
           </w:p>
           <w:p>
             <w:pPr>
@@ -1673,22 +2698,63 @@
                 <w:sz w:val="22"/>
                 <w:szCs w:val="22"/>
               </w:rPr>
-              <w:t>_____</w:t>
-            </w:r>
-            <w:r>
-              <w:rPr>
-                <w:sz w:val="22"/>
-                <w:szCs w:val="22"/>
-              </w:rPr>
-              <w:t>{% endif %}</w:t>
-            </w:r>
-            <w:r>
-              <w:rPr>
-                <w:sz w:val="22"/>
-                <w:szCs w:val="22"/>
-              </w:rPr>
-              <w:t>{% else %}</w:t>
-            </w:r>
+              <w:t>____</w:t>
+            </w:r>
+            <w:proofErr w:type="gramStart"/>
+            <w:r>
+              <w:rPr>
+                <w:sz w:val="22"/>
+                <w:szCs w:val="22"/>
+              </w:rPr>
+              <w:t>_</w:t>
+            </w:r>
+            <w:r>
+              <w:rPr>
+                <w:sz w:val="22"/>
+                <w:szCs w:val="22"/>
+              </w:rPr>
+              <w:t>{</w:t>
+            </w:r>
+            <w:proofErr w:type="gramEnd"/>
+            <w:r>
+              <w:rPr>
+                <w:sz w:val="22"/>
+                <w:szCs w:val="22"/>
+              </w:rPr>
+              <w:t xml:space="preserve">% endif </w:t>
+            </w:r>
+            <w:proofErr w:type="gramStart"/>
+            <w:r>
+              <w:rPr>
+                <w:sz w:val="22"/>
+                <w:szCs w:val="22"/>
+              </w:rPr>
+              <w:t>%}</w:t>
+            </w:r>
+            <w:r>
+              <w:rPr>
+                <w:sz w:val="22"/>
+                <w:szCs w:val="22"/>
+              </w:rPr>
+              <w:t>{</w:t>
+            </w:r>
+            <w:proofErr w:type="gramEnd"/>
+            <w:r>
+              <w:rPr>
+                <w:sz w:val="22"/>
+                <w:szCs w:val="22"/>
+              </w:rPr>
+              <w:t xml:space="preserve">% </w:t>
+            </w:r>
+            <w:proofErr w:type="gramStart"/>
+            <w:r>
+              <w:rPr>
+                <w:sz w:val="22"/>
+                <w:szCs w:val="22"/>
+              </w:rPr>
+              <w:t>else %}</w:t>
+            </w:r>
+            <w:proofErr w:type="gramEnd"/>
           </w:p>
           <w:p>
             <w:pPr>
@@ -1826,15 +2892,40 @@
                 <w:sz w:val="22"/>
                 <w:szCs w:val="22"/>
               </w:rPr>
-              <w:t>_________</w:t>
-            </w:r>
-            <w:r>
-              <w:rPr>
-                <w:sz w:val="22"/>
-                <w:szCs w:val="22"/>
-              </w:rPr>
-              <w:t>{% endif %}</w:t>
-            </w:r>
+              <w:t>________</w:t>
+            </w:r>
+            <w:proofErr w:type="gramStart"/>
+            <w:r>
+              <w:rPr>
+                <w:sz w:val="22"/>
+                <w:szCs w:val="22"/>
+              </w:rPr>
+              <w:t>_</w:t>
+            </w:r>
+            <w:r>
+              <w:rPr>
+                <w:sz w:val="22"/>
+                <w:szCs w:val="22"/>
+              </w:rPr>
+              <w:t>{</w:t>
+            </w:r>
+            <w:proofErr w:type="gramEnd"/>
+            <w:r>
+              <w:rPr>
+                <w:sz w:val="22"/>
+                <w:szCs w:val="22"/>
+              </w:rPr>
+              <w:t xml:space="preserve">% </w:t>
+            </w:r>
+            <w:proofErr w:type="gramStart"/>
+            <w:r>
+              <w:rPr>
+                <w:sz w:val="22"/>
+                <w:szCs w:val="22"/>
+              </w:rPr>
+              <w:t>endif %}</w:t>
+            </w:r>
+            <w:proofErr w:type="gramEnd"/>
           </w:p>
           <w:p>
             <w:pPr>
@@ -1871,7 +2962,7 @@
 </file>
 
 <file path=word/styles.xml><?xml version="1.0" encoding="utf-8"?>
-<w:styles xmlns:mc="http://schemas.openxmlformats.org/markup-compatibility/2006" xmlns:r="http://schemas.openxmlformats.org/officeDocument/2006/relationships" xmlns:w="http://schemas.openxmlformats.org/wordprocessingml/2006/main" xmlns:w14="http://schemas.microsoft.com/office/word/2010/wordml" xmlns:w15="http://schemas.microsoft.com/office/word/2012/wordml" xmlns:w16se="http://schemas.microsoft.com/office/word/2015/wordml/symex" mc:Ignorable="w14 w15 w16se">
+<w:styles xmlns:mc="http://schemas.openxmlformats.org/markup-compatibility/2006" xmlns:r="http://schemas.openxmlformats.org/officeDocument/2006/relationships" xmlns:w="http://schemas.openxmlformats.org/wordprocessingml/2006/main" xmlns:w14="http://schemas.microsoft.com/office/word/2010/wordml" xmlns:w15="http://schemas.microsoft.com/office/word/2012/wordml" xmlns:w16cex="http://schemas.microsoft.com/office/word/2018/wordml/cex" xmlns:w16cid="http://schemas.microsoft.com/office/word/2016/wordml/cid" xmlns:w16="http://schemas.microsoft.com/office/word/2018/wordml" xmlns:w16du="http://schemas.microsoft.com/office/word/2023/wordml/word16du" xmlns:w16sdtdh="http://schemas.microsoft.com/office/word/2020/wordml/sdtdatahash" xmlns:w16sdtfl="http://schemas.microsoft.com/office/word/2024/wordml/sdtformatlock" xmlns:w16se="http://schemas.microsoft.com/office/word/2015/wordml/symex" mc:Ignorable="w14 w15 w16se w16cid w16 w16cex w16sdtdh w16sdtfl w16du">
   <w:docDefaults>
     <w:rPrDefault>
       <w:rPr>
@@ -1887,7 +2978,7 @@
       </w:pPr>
     </w:pPrDefault>
   </w:docDefaults>
-  <w:latentStyles w:defLockedState="0" w:defUIPriority="99" w:defSemiHidden="0" w:defUnhideWhenUsed="0" w:defQFormat="0" w:count="371">
+  <w:latentStyles w:defLockedState="0" w:defUIPriority="99" w:defSemiHidden="0" w:defUnhideWhenUsed="0" w:defQFormat="0" w:count="376">
     <w:lsdException w:name="Normal" w:uiPriority="0" w:qFormat="1"/>
     <w:lsdException w:name="heading 1" w:uiPriority="9" w:qFormat="1"/>
     <w:lsdException w:name="heading 2" w:semiHidden="1" w:uiPriority="9" w:unhideWhenUsed="1" w:qFormat="1"/>
@@ -2258,6 +3349,11 @@
     <w:lsdException w:name="List Table 5 Dark Accent 6" w:uiPriority="50"/>
     <w:lsdException w:name="List Table 6 Colorful Accent 6" w:uiPriority="51"/>
     <w:lsdException w:name="List Table 7 Colorful Accent 6" w:uiPriority="52"/>
+    <w:lsdException w:name="Mention" w:semiHidden="1" w:unhideWhenUsed="1"/>
+    <w:lsdException w:name="Smart Hyperlink" w:semiHidden="1" w:unhideWhenUsed="1"/>
+    <w:lsdException w:name="Hashtag" w:semiHidden="1" w:unhideWhenUsed="1"/>
+    <w:lsdException w:name="Unresolved Mention" w:semiHidden="1" w:unhideWhenUsed="1"/>
+    <w:lsdException w:name="Smart Link" w:semiHidden="1" w:unhideWhenUsed="1"/>
   </w:latentStyles>
   <w:style w:type="paragraph" w:default="1" w:styleId="Normal">
     <w:name w:val="Normal"/>

</xml_diff>

<commit_message>
Updated county question and ilao urls
</commit_message>
<xml_diff>
--- a/docassemble/LivingWill/data/templates/Living_Will_DA_Template.docx
+++ b/docassemble/LivingWill/data/templates/Living_Will_DA_Template.docx
@@ -604,30 +604,7 @@
           <w:sz w:val="22"/>
           <w:szCs w:val="22"/>
         </w:rPr>
-        <w:t>trial_</w:t>
-      </w:r>
-      <w:proofErr w:type="gramStart"/>
-      <w:r>
-        <w:rPr>
-          <w:sz w:val="22"/>
-          <w:szCs w:val="22"/>
-        </w:rPr>
-        <w:t>court</w:t>
-      </w:r>
-      <w:r>
-        <w:rPr>
-          <w:sz w:val="22"/>
-          <w:szCs w:val="22"/>
-        </w:rPr>
-        <w:t>.address</w:t>
-      </w:r>
-      <w:proofErr w:type="gramEnd"/>
-      <w:r>
-        <w:rPr>
-          <w:sz w:val="22"/>
-          <w:szCs w:val="22"/>
-        </w:rPr>
-        <w:t>.county</w:t>
+        <w:t>home_county</w:t>
       </w:r>
       <w:proofErr w:type="spellEnd"/>
       <w:r>

</xml_diff>